<commit_message>
Add FID Stage 1 pilot proposal (Markdown, DOCX, PDF)
Drafts the 18-month, 48-institution pilot with a cluster-randomised
phased roll-out, evaluation design, budget and risk register. Also
regenerates the Stage 0 DOCX/PDF with content-aware table column
widths and code blocks kept on one page.

Co-Authored-By: Claude Fable 5.1 <noreply@anthropic.com>
Claude-Session: https://claude.ai/code/session_01HcnLi5kHayuQJykKoA2bdB
</commit_message>
<xml_diff>
--- a/docs/FID_Stage0_Concept_Note.docx
+++ b/docs/FID_Stage0_Concept_Note.docx
@@ -332,8 +332,8 @@
         </w:tblBorders>
       </w:tblPr>
       <w:tblGrid>
-        <w:gridCol w:w="3012"/>
-        <w:gridCol w:w="6626"/>
+        <w:gridCol w:w="2803"/>
+        <w:gridCol w:w="6835"/>
       </w:tblGrid>
       <w:tr>
         <w:trPr>
@@ -752,9 +752,9 @@
         </w:tblBorders>
       </w:tblPr>
       <w:tblGrid>
-        <w:gridCol w:w="2209"/>
-        <w:gridCol w:w="4819"/>
-        <w:gridCol w:w="2610"/>
+        <w:gridCol w:w="2137"/>
+        <w:gridCol w:w="3986"/>
+        <w:gridCol w:w="3515"/>
       </w:tblGrid>
       <w:tr>
         <w:trPr>
@@ -1146,9 +1146,9 @@
         </w:tblBorders>
       </w:tblPr>
       <w:tblGrid>
-        <w:gridCol w:w="2209"/>
-        <w:gridCol w:w="4819"/>
-        <w:gridCol w:w="2610"/>
+        <w:gridCol w:w="6144"/>
+        <w:gridCol w:w="1688"/>
+        <w:gridCol w:w="1806"/>
       </w:tblGrid>
       <w:tr>
         <w:trPr>
@@ -1693,10 +1693,10 @@
         </w:tblBorders>
       </w:tblPr>
       <w:tblGrid>
-        <w:gridCol w:w="771"/>
-        <w:gridCol w:w="4241"/>
-        <w:gridCol w:w="3084"/>
-        <w:gridCol w:w="1542"/>
+        <w:gridCol w:w="607"/>
+        <w:gridCol w:w="4094"/>
+        <w:gridCol w:w="3858"/>
+        <w:gridCol w:w="1079"/>
       </w:tblGrid>
       <w:tr>
         <w:trPr>
@@ -2708,9 +2708,9 @@
         </w:tblBorders>
       </w:tblPr>
       <w:tblGrid>
-        <w:gridCol w:w="2209"/>
-        <w:gridCol w:w="4819"/>
-        <w:gridCol w:w="2610"/>
+        <w:gridCol w:w="3233"/>
+        <w:gridCol w:w="3673"/>
+        <w:gridCol w:w="2732"/>
       </w:tblGrid>
       <w:tr>
         <w:trPr>
@@ -3333,9 +3333,9 @@
         </w:tblBorders>
       </w:tblPr>
       <w:tblGrid>
-        <w:gridCol w:w="2209"/>
-        <w:gridCol w:w="4819"/>
-        <w:gridCol w:w="2610"/>
+        <w:gridCol w:w="2910"/>
+        <w:gridCol w:w="4173"/>
+        <w:gridCol w:w="2555"/>
       </w:tblGrid>
       <w:tr>
         <w:trPr>
@@ -3943,9 +3943,9 @@
         </w:tblBorders>
       </w:tblPr>
       <w:tblGrid>
-        <w:gridCol w:w="2209"/>
-        <w:gridCol w:w="4819"/>
-        <w:gridCol w:w="2610"/>
+        <w:gridCol w:w="6034"/>
+        <w:gridCol w:w="1310"/>
+        <w:gridCol w:w="2294"/>
       </w:tblGrid>
       <w:tr>
         <w:trPr>
@@ -4714,9 +4714,9 @@
         </w:tblBorders>
       </w:tblPr>
       <w:tblGrid>
-        <w:gridCol w:w="2209"/>
-        <w:gridCol w:w="4819"/>
-        <w:gridCol w:w="2610"/>
+        <w:gridCol w:w="3798"/>
+        <w:gridCol w:w="1812"/>
+        <w:gridCol w:w="4028"/>
       </w:tblGrid>
       <w:tr>
         <w:trPr>
@@ -5280,6 +5280,8 @@
     </w:p>
     <w:p>
       <w:pPr>
+        <w:keepNext/>
+        <w:keepLines/>
         <w:shd w:fill="F1F5F9" w:val="clear"/>
         <w:spacing w:after="0"/>
       </w:pPr>
@@ -5294,6 +5296,8 @@
     </w:p>
     <w:p>
       <w:pPr>
+        <w:keepNext/>
+        <w:keepLines/>
         <w:shd w:fill="F1F5F9" w:val="clear"/>
         <w:spacing w:after="0"/>
       </w:pPr>
@@ -5308,6 +5312,8 @@
     </w:p>
     <w:p>
       <w:pPr>
+        <w:keepNext/>
+        <w:keepLines/>
         <w:shd w:fill="F1F5F9" w:val="clear"/>
         <w:spacing w:after="0"/>
       </w:pPr>
@@ -5322,6 +5328,8 @@
     </w:p>
     <w:p>
       <w:pPr>
+        <w:keepNext/>
+        <w:keepLines/>
         <w:shd w:fill="F1F5F9" w:val="clear"/>
         <w:spacing w:after="0"/>
       </w:pPr>
@@ -5336,6 +5344,8 @@
     </w:p>
     <w:p>
       <w:pPr>
+        <w:keepNext/>
+        <w:keepLines/>
         <w:shd w:fill="F1F5F9" w:val="clear"/>
         <w:spacing w:after="0"/>
       </w:pPr>
@@ -5350,6 +5360,8 @@
     </w:p>
     <w:p>
       <w:pPr>
+        <w:keepNext/>
+        <w:keepLines/>
         <w:shd w:fill="F1F5F9" w:val="clear"/>
         <w:spacing w:after="0"/>
       </w:pPr>
@@ -5364,6 +5376,8 @@
     </w:p>
     <w:p>
       <w:pPr>
+        <w:keepNext/>
+        <w:keepLines/>
         <w:shd w:fill="F1F5F9" w:val="clear"/>
         <w:spacing w:after="0"/>
       </w:pPr>
@@ -5378,6 +5392,8 @@
     </w:p>
     <w:p>
       <w:pPr>
+        <w:keepNext/>
+        <w:keepLines/>
         <w:shd w:fill="F1F5F9" w:val="clear"/>
         <w:spacing w:after="0"/>
       </w:pPr>
@@ -5392,6 +5408,8 @@
     </w:p>
     <w:p>
       <w:pPr>
+        <w:keepNext/>
+        <w:keepLines/>
         <w:shd w:fill="F1F5F9" w:val="clear"/>
         <w:spacing w:after="0"/>
       </w:pPr>
@@ -5446,9 +5464,9 @@
         </w:tblBorders>
       </w:tblPr>
       <w:tblGrid>
-        <w:gridCol w:w="2209"/>
-        <w:gridCol w:w="4819"/>
-        <w:gridCol w:w="2610"/>
+        <w:gridCol w:w="2899"/>
+        <w:gridCol w:w="4036"/>
+        <w:gridCol w:w="2703"/>
       </w:tblGrid>
       <w:tr>
         <w:trPr>

</xml_diff>